<commit_message>
doc: Adicionado o digrama de entidade relacionamento e atualização dos requisitos funcionais
</commit_message>
<xml_diff>
--- a/ApêndiceB-Requisitos/PID_RequisitosFuncionais.docx
+++ b/ApêndiceB-Requisitos/PID_RequisitosFuncionais.docx
@@ -120,15 +120,7 @@
                 <w:sz w:val="24"/>
                 <w:szCs w:val="24"/>
               </w:rPr>
-              <w:t>27</w:t>
-            </w:r>
-            <w:r>
-              <w:rPr>
-                <w:rFonts w:ascii="Times New Roman" w:eastAsia="Times New Roman" w:hAnsi="Times New Roman" w:cs="Times New Roman"/>
-                <w:sz w:val="24"/>
-                <w:szCs w:val="24"/>
-              </w:rPr>
-              <w:t>/03/2026</w:t>
+              <w:t>27/03/2026</w:t>
             </w:r>
           </w:p>
         </w:tc>
@@ -323,7 +315,23 @@
           <w:sz w:val="24"/>
           <w:szCs w:val="24"/>
         </w:rPr>
-        <w:t xml:space="preserve"> O sistema deve permitir que novos usuários realizem cadastro na plataforma informando dados básicos como nome, e-mail, telefone e senha, além de selecionar o tipo de conta (cliente ou profissional).</w:t>
+        <w:t xml:space="preserve"> O sistema deve permitir que novos usuários realizem cadastro na plataforma informando dados básicos como nome, e-mail, telefone e senha, além de selecionar o tipo de conta (cliente ou profissional)</w:t>
+      </w:r>
+      <w:r>
+        <w:rPr>
+          <w:rFonts w:ascii="Times New Roman" w:eastAsia="Times New Roman" w:hAnsi="Times New Roman" w:cs="Times New Roman"/>
+          <w:sz w:val="24"/>
+          <w:szCs w:val="24"/>
+        </w:rPr>
+        <w:t>, mas o profissional também de ser cliente e o inverso também é possível</w:t>
+      </w:r>
+      <w:r>
+        <w:rPr>
+          <w:rFonts w:ascii="Times New Roman" w:eastAsia="Times New Roman" w:hAnsi="Times New Roman" w:cs="Times New Roman"/>
+          <w:sz w:val="24"/>
+          <w:szCs w:val="24"/>
+        </w:rPr>
+        <w:t>.</w:t>
       </w:r>
     </w:p>
     <w:p>

</xml_diff>